<commit_message>
build: add survey scale tbl
</commit_message>
<xml_diff>
--- a/manuscript/manuscript.docx
+++ b/manuscript/manuscript.docx
@@ -125,29 +125,6 @@
         </w:r>
       </w:hyperlink>
     </w:p>
-    <w:p>
-      <w:pPr>
-        <w:pStyle w:val="SourceCode"/>
-      </w:pPr>
-      <w:r>
-        <w:br/>
-      </w:r>
-      <w:r>
-        <w:rPr>
-          <w:rStyle w:val="VerbatimChar"/>
-        </w:rPr>
-        <w:t xml:space="preserve">The downloaded binary packages are in</w:t>
-      </w:r>
-      <w:r>
-        <w:br/>
-      </w:r>
-      <w:r>
-        <w:rPr>
-          <w:rStyle w:val="VerbatimChar"/>
-        </w:rPr>
-        <w:t xml:space="preserve">    /var/folders/x4/3lxftn1s4zgf32y4j4tqx4kh0000gn/T//RtmpvVXebF/downloaded_packages</w:t>
-      </w:r>
-    </w:p>
     <w:bookmarkStart w:id="21" w:name="abstract"/>
     <w:p>
       <w:pPr>
@@ -590,7 +567,7 @@
       </w:r>
     </w:p>
     <w:bookmarkEnd w:id="22"/>
-    <w:bookmarkStart w:id="32" w:name="sec-methods"/>
+    <w:bookmarkStart w:id="33" w:name="sec-methods"/>
     <w:p>
       <w:pPr>
         <w:pStyle w:val="Heading1"/>
@@ -1182,7 +1159,7 @@
       </w:r>
     </w:p>
     <w:bookmarkEnd w:id="28"/>
-    <w:bookmarkStart w:id="29" w:name="subjective-measurements"/>
+    <w:bookmarkStart w:id="30" w:name="subjective-measurements"/>
     <w:p>
       <w:pPr>
         <w:pStyle w:val="Heading2"/>
@@ -1214,256 +1191,24 @@
         <w:t xml:space="preserve"> </w:t>
       </w:r>
       <w:r>
-        <w:t xml:space="preserve">summarized in Table XX below.</w:t>
-      </w:r>
-    </w:p>
-    <w:p>
-      <w:pPr>
-        <w:pStyle w:val="Compact"/>
-        <w:numPr>
-          <w:ilvl w:val="0"/>
-          <w:numId w:val="1001"/>
-        </w:numPr>
-      </w:pPr>
-      <w:r>
-        <w:rPr>
-          <w:b/>
-          <w:bCs/>
-        </w:rPr>
-        <w:t xml:space="preserve">Whole-body thermal sensation</w:t>
-      </w:r>
-      <w:r>
-        <w:t xml:space="preserve">: 7-point ASHRAE scale (−3 cold to</w:t>
-      </w:r>
-      <w:r>
-        <w:t xml:space="preserve"> </w:t>
-      </w:r>
-      <w:r>
-        <w:t xml:space="preserve">+3 hot)</w:t>
-      </w:r>
-    </w:p>
-    <w:p>
-      <w:pPr>
-        <w:pStyle w:val="Compact"/>
-        <w:numPr>
-          <w:ilvl w:val="0"/>
-          <w:numId w:val="1001"/>
-        </w:numPr>
-      </w:pPr>
-      <w:r>
-        <w:rPr>
-          <w:b/>
-          <w:bCs/>
-        </w:rPr>
-        <w:t xml:space="preserve">Whole-body thermal comfort</w:t>
-      </w:r>
-      <w:r>
-        <w:t xml:space="preserve">: continuous scale</w:t>
-      </w:r>
-    </w:p>
-    <w:p>
-      <w:pPr>
-        <w:pStyle w:val="Compact"/>
-        <w:numPr>
-          <w:ilvl w:val="0"/>
-          <w:numId w:val="1001"/>
-        </w:numPr>
-      </w:pPr>
-      <w:r>
-        <w:rPr>
-          <w:b/>
-          <w:bCs/>
-        </w:rPr>
-        <w:t xml:space="preserve">Whole-body thermal preference</w:t>
-      </w:r>
-      <w:r>
-        <w:t xml:space="preserve">: 3-point scale (cooler / no change</w:t>
-      </w:r>
-      <w:r>
-        <w:t xml:space="preserve"> </w:t>
-      </w:r>
-      <w:r>
-        <w:t xml:space="preserve">/ warmer)</w:t>
-      </w:r>
-    </w:p>
-    <w:p>
-      <w:pPr>
-        <w:pStyle w:val="Compact"/>
-        <w:numPr>
-          <w:ilvl w:val="0"/>
-          <w:numId w:val="1001"/>
-        </w:numPr>
-      </w:pPr>
-      <w:r>
-        <w:rPr>
-          <w:b/>
-          <w:bCs/>
-        </w:rPr>
-        <w:t xml:space="preserve">Local thermal sensation at ankles</w:t>
-      </w:r>
-      <w:r>
-        <w:t xml:space="preserve">: 7-point scale</w:t>
-      </w:r>
-    </w:p>
-    <w:p>
-      <w:pPr>
-        <w:pStyle w:val="Compact"/>
-        <w:numPr>
-          <w:ilvl w:val="0"/>
-          <w:numId w:val="1001"/>
-        </w:numPr>
-      </w:pPr>
-      <w:r>
-        <w:rPr>
-          <w:b/>
-          <w:bCs/>
-        </w:rPr>
-        <w:t xml:space="preserve">Local thermal preference at ankles</w:t>
-      </w:r>
-      <w:r>
-        <w:t xml:space="preserve">: 3-point scale</w:t>
-      </w:r>
-    </w:p>
-    <w:p>
-      <w:pPr>
-        <w:pStyle w:val="Compact"/>
-        <w:numPr>
-          <w:ilvl w:val="0"/>
-          <w:numId w:val="1001"/>
-        </w:numPr>
-      </w:pPr>
-      <w:r>
-        <w:rPr>
-          <w:b/>
-          <w:bCs/>
-        </w:rPr>
-        <w:t xml:space="preserve">Air movement acceptability at ankles</w:t>
-      </w:r>
-      <w:r>
-        <w:t xml:space="preserve">: 5-point scale (very</w:t>
-      </w:r>
-      <w:r>
-        <w:t xml:space="preserve"> </w:t>
-      </w:r>
-      <w:r>
-        <w:t xml:space="preserve">unacceptable to very acceptable)</w:t>
-      </w:r>
-    </w:p>
-    <w:p>
-      <w:pPr>
-        <w:pStyle w:val="Compact"/>
-        <w:numPr>
-          <w:ilvl w:val="0"/>
-          <w:numId w:val="1001"/>
-        </w:numPr>
-      </w:pPr>
-      <w:r>
-        <w:rPr>
-          <w:b/>
-          <w:bCs/>
-        </w:rPr>
-        <w:t xml:space="preserve">Air movement preference at ankles</w:t>
-      </w:r>
-      <w:r>
-        <w:t xml:space="preserve">: 3-point scale (lower / no</w:t>
-      </w:r>
-      <w:r>
-        <w:t xml:space="preserve"> </w:t>
-      </w:r>
-      <w:r>
-        <w:t xml:space="preserve">change / higher)</w:t>
-      </w:r>
-    </w:p>
-    <w:p>
-      <w:pPr>
-        <w:pStyle w:val="FirstParagraph"/>
-      </w:pPr>
-      <w:r>
-        <w:t xml:space="preserve">Surveys were administered electronically via Qualtrics. Participants</w:t>
-      </w:r>
-      <w:r>
-        <w:t xml:space="preserve"> </w:t>
-      </w:r>
-      <w:r>
-        <w:t xml:space="preserve">were not required to respond to any individual question, though</w:t>
-      </w:r>
-      <w:r>
-        <w:t xml:space="preserve"> </w:t>
-      </w:r>
-      <w:r>
-        <w:t xml:space="preserve">completion rates were monitored.</w:t>
-      </w:r>
-    </w:p>
-    <w:bookmarkEnd w:id="29"/>
-    <w:bookmarkStart w:id="30" w:name="physiological-measurements"/>
-    <w:p>
-      <w:pPr>
-        <w:pStyle w:val="Heading2"/>
-      </w:pPr>
-      <w:r>
-        <w:t xml:space="preserve">2.8 Physiological measurements</w:t>
-      </w:r>
-    </w:p>
-    <w:p>
-      <w:pPr>
-        <w:pStyle w:val="FirstParagraph"/>
-      </w:pPr>
-      <w:r>
-        <w:t xml:space="preserve">Skin temperature was recorded continuously using the iButton sensors</w:t>
-      </w:r>
-      <w:r>
-        <w:t xml:space="preserve"> </w:t>
-      </w:r>
-      <w:r>
-        <w:t xml:space="preserve">attached with medical-grade hypoallergenic tape. Sensors were placed on</w:t>
-      </w:r>
-      <w:r>
-        <w:t xml:space="preserve"> </w:t>
-      </w:r>
-      <w:r>
-        <w:t xml:space="preserve">the lateral lower leg (mid-calf) and feet. Skin temperature data were</w:t>
-      </w:r>
-      <w:r>
-        <w:t xml:space="preserve"> </w:t>
-      </w:r>
-      <w:r>
-        <w:t xml:space="preserve">used to assess local cooling responses and as physiological correlates</w:t>
-      </w:r>
-      <w:r>
-        <w:t xml:space="preserve"> </w:t>
-      </w:r>
-      <w:r>
-        <w:t xml:space="preserve">of subjective thermal sensation.</w:t>
-      </w:r>
-    </w:p>
-    <w:bookmarkEnd w:id="30"/>
-    <w:bookmarkStart w:id="31" w:name="statistical-analysis-and-data-processing"/>
-    <w:p>
-      <w:pPr>
-        <w:pStyle w:val="Heading2"/>
-      </w:pPr>
-      <w:r>
-        <w:t xml:space="preserve">2.9 Statistical analysis and data processing</w:t>
-      </w:r>
-    </w:p>
-    <w:bookmarkEnd w:id="31"/>
-    <w:bookmarkEnd w:id="32"/>
-    <w:bookmarkStart w:id="48" w:name="results"/>
-    <w:p>
-      <w:pPr>
-        <w:pStyle w:val="Heading1"/>
-      </w:pPr>
-      <w:r>
-        <w:t xml:space="preserve">3. Results</w:t>
-      </w:r>
-    </w:p>
-    <w:bookmarkStart w:id="35" w:name="X7c2c88ad051007eed246cb0019e3320707ea507"/>
-    <w:p>
-      <w:pPr>
-        <w:pStyle w:val="Heading2"/>
-      </w:pPr>
-      <w:r>
-        <w:t xml:space="preserve">3.1 Participants and environmental conditions</w:t>
+        <w:t xml:space="preserve">summarized in</w:t>
+      </w:r>
+      <w:r>
+        <w:t xml:space="preserve"> </w:t>
+      </w:r>
+      <w:hyperlink w:anchor="tbl-scales">
+        <w:r>
+          <w:rPr>
+            <w:rStyle w:val="Hyperlink"/>
+          </w:rPr>
+          <w:t xml:space="preserve">Table 1</w:t>
+        </w:r>
+      </w:hyperlink>
+      <w:r>
+        <w:t xml:space="preserve"> </w:t>
+      </w:r>
+      <w:r>
+        <w:t xml:space="preserve">below.</w:t>
       </w:r>
     </w:p>
     <w:tbl>
@@ -1479,7 +1224,7 @@
       <w:tr>
         <w:tc>
           <w:tcPr/>
-          <w:bookmarkStart w:id="33" w:name="tbl-demographics"/>
+          <w:bookmarkStart w:id="29" w:name="tbl-scales"/>
           <w:p>
             <w:pPr>
               <w:jc w:val="center"/>
@@ -1490,7 +1235,742 @@
               <w:pStyle w:val="ImageCaption"/>
             </w:pPr>
             <w:r>
-              <w:t xml:space="preserve">Table 1: Summary of demographic information (mean ± SD) on study participants.</w:t>
+              <w:t xml:space="preserve">Table 1: Survey constructs and measurement scales</w:t>
+            </w:r>
+          </w:p>
+          <w:tbl>
+            <w:tblPr>
+              <w:tblStyle w:val="Table"/>
+              <w:tblW w:type="pct" w:w="5000"/>
+              <w:tblLayout w:type="fixed"/>
+              <w:tblLook w:firstRow="1" w:lastRow="0" w:firstColumn="0" w:lastColumn="0" w:noHBand="0" w:noVBand="0" w:val="0020"/>
+            </w:tblPr>
+            <w:tblGrid>
+              <w:gridCol w:w="1188"/>
+              <w:gridCol w:w="1980"/>
+              <w:gridCol w:w="1188"/>
+              <w:gridCol w:w="3564"/>
+            </w:tblGrid>
+            <w:tr>
+              <w:trPr>
+                <w:tblHeader w:val="on"/>
+              </w:trPr>
+              <w:tc>
+                <w:tcPr/>
+                <w:p>
+                  <w:pPr>
+                    <w:pStyle w:val="Compact"/>
+                    <w:jc w:val="left"/>
+                    <w:jc w:val="center"/>
+                  </w:pPr>
+                  <w:r>
+                    <w:t xml:space="preserve">Construct</w:t>
+                  </w:r>
+                </w:p>
+              </w:tc>
+              <w:tc>
+                <w:tcPr/>
+                <w:p>
+                  <w:pPr>
+                    <w:pStyle w:val="Compact"/>
+                    <w:jc w:val="left"/>
+                    <w:jc w:val="center"/>
+                  </w:pPr>
+                  <w:r>
+                    <w:t xml:space="preserve">Question</w:t>
+                  </w:r>
+                </w:p>
+              </w:tc>
+              <w:tc>
+                <w:tcPr/>
+                <w:p>
+                  <w:pPr>
+                    <w:pStyle w:val="Compact"/>
+                    <w:jc w:val="left"/>
+                    <w:jc w:val="center"/>
+                  </w:pPr>
+                  <w:r>
+                    <w:t xml:space="preserve">Scale type</w:t>
+                  </w:r>
+                </w:p>
+              </w:tc>
+              <w:tc>
+                <w:tcPr/>
+                <w:p>
+                  <w:pPr>
+                    <w:pStyle w:val="Compact"/>
+                    <w:jc w:val="left"/>
+                    <w:jc w:val="center"/>
+                  </w:pPr>
+                  <w:r>
+                    <w:t xml:space="preserve">Levels</w:t>
+                  </w:r>
+                </w:p>
+              </w:tc>
+            </w:tr>
+            <w:tr>
+              <w:tc>
+                <w:tcPr/>
+                <w:p>
+                  <w:pPr>
+                    <w:pStyle w:val="Compact"/>
+                    <w:jc w:val="left"/>
+                    <w:jc w:val="center"/>
+                  </w:pPr>
+                  <w:r>
+                    <w:t xml:space="preserve">Thermal sensation</w:t>
+                  </w:r>
+                </w:p>
+              </w:tc>
+              <w:tc>
+                <w:tcPr/>
+                <w:p>
+                  <w:pPr>
+                    <w:pStyle w:val="Compact"/>
+                    <w:jc w:val="left"/>
+                    <w:jc w:val="center"/>
+                  </w:pPr>
+                  <w:r>
+                    <w:t xml:space="preserve">How do you feel right now?</w:t>
+                  </w:r>
+                </w:p>
+              </w:tc>
+              <w:tc>
+                <w:tcPr/>
+                <w:p>
+                  <w:pPr>
+                    <w:pStyle w:val="Compact"/>
+                    <w:jc w:val="left"/>
+                    <w:jc w:val="center"/>
+                  </w:pPr>
+                  <w:r>
+                    <w:t xml:space="preserve">7-point continuous</w:t>
+                  </w:r>
+                </w:p>
+              </w:tc>
+              <w:tc>
+                <w:tcPr/>
+                <w:p>
+                  <w:pPr>
+                    <w:pStyle w:val="Compact"/>
+                    <w:jc w:val="left"/>
+                    <w:jc w:val="center"/>
+                  </w:pPr>
+                  <w:r>
+                    <w:t xml:space="preserve">−3 (cold) −2 (cool) −1 (slightly cool) 0 (neutral) +1 (slightly warm) +2 (warm) +3 (hot)</w:t>
+                  </w:r>
+                </w:p>
+              </w:tc>
+            </w:tr>
+            <w:tr>
+              <w:tc>
+                <w:tcPr/>
+                <w:p>
+                  <w:pPr>
+                    <w:pStyle w:val="Compact"/>
+                    <w:jc w:val="left"/>
+                    <w:jc w:val="center"/>
+                  </w:pPr>
+                  <w:r>
+                    <w:t xml:space="preserve">Thermal comfort</w:t>
+                  </w:r>
+                </w:p>
+              </w:tc>
+              <w:tc>
+                <w:tcPr/>
+                <w:p>
+                  <w:pPr>
+                    <w:pStyle w:val="Compact"/>
+                    <w:jc w:val="left"/>
+                    <w:jc w:val="center"/>
+                  </w:pPr>
+                  <w:r>
+                    <w:t xml:space="preserve">Right now do you find this environment…?</w:t>
+                  </w:r>
+                </w:p>
+              </w:tc>
+              <w:tc>
+                <w:tcPr/>
+                <w:p>
+                  <w:pPr>
+                    <w:pStyle w:val="Compact"/>
+                    <w:jc w:val="left"/>
+                    <w:jc w:val="center"/>
+                  </w:pPr>
+                  <w:r>
+                    <w:t xml:space="preserve">6-point continuous</w:t>
+                  </w:r>
+                </w:p>
+              </w:tc>
+              <w:tc>
+                <w:tcPr/>
+                <w:p>
+                  <w:pPr>
+                    <w:pStyle w:val="Compact"/>
+                    <w:jc w:val="left"/>
+                    <w:jc w:val="center"/>
+                  </w:pPr>
+                  <w:r>
+                    <w:t xml:space="preserve">−3 (very uncomfortable) −2 (uncomfortable) −1 (just uncomfortable) +1 (just comfortable) +2 (comfortable) +3 (very comfortable)</w:t>
+                  </w:r>
+                </w:p>
+              </w:tc>
+            </w:tr>
+            <w:tr>
+              <w:tc>
+                <w:tcPr/>
+                <w:p>
+                  <w:pPr>
+                    <w:pStyle w:val="Compact"/>
+                    <w:jc w:val="left"/>
+                    <w:jc w:val="center"/>
+                  </w:pPr>
+                  <w:r>
+                    <w:t xml:space="preserve">Thermal preference</w:t>
+                  </w:r>
+                </w:p>
+              </w:tc>
+              <w:tc>
+                <w:tcPr/>
+                <w:p>
+                  <w:pPr>
+                    <w:pStyle w:val="Compact"/>
+                    <w:jc w:val="left"/>
+                    <w:jc w:val="center"/>
+                  </w:pPr>
+                  <w:r>
+                    <w:t xml:space="preserve">Right now would you prefer to be…?</w:t>
+                  </w:r>
+                </w:p>
+              </w:tc>
+              <w:tc>
+                <w:tcPr/>
+                <w:p>
+                  <w:pPr>
+                    <w:pStyle w:val="Compact"/>
+                    <w:jc w:val="left"/>
+                    <w:jc w:val="center"/>
+                  </w:pPr>
+                  <w:r>
+                    <w:t xml:space="preserve">3-point ordinal</w:t>
+                  </w:r>
+                </w:p>
+              </w:tc>
+              <w:tc>
+                <w:tcPr/>
+                <w:p>
+                  <w:pPr>
+                    <w:pStyle w:val="Compact"/>
+                    <w:jc w:val="left"/>
+                    <w:jc w:val="center"/>
+                  </w:pPr>
+                  <w:r>
+                    <w:t xml:space="preserve">−1 (warmer) | 0 (no change) | +1 (cooler)</w:t>
+                  </w:r>
+                </w:p>
+              </w:tc>
+            </w:tr>
+            <w:tr>
+              <w:tc>
+                <w:tcPr/>
+                <w:p>
+                  <w:pPr>
+                    <w:pStyle w:val="Compact"/>
+                    <w:jc w:val="left"/>
+                    <w:jc w:val="center"/>
+                  </w:pPr>
+                  <w:r>
+                    <w:t xml:space="preserve">Thermal acceptability</w:t>
+                  </w:r>
+                </w:p>
+              </w:tc>
+              <w:tc>
+                <w:tcPr/>
+                <w:p>
+                  <w:pPr>
+                    <w:pStyle w:val="Compact"/>
+                    <w:jc w:val="left"/>
+                    <w:jc w:val="center"/>
+                  </w:pPr>
+                  <w:r>
+                    <w:t xml:space="preserve">Please rate your acceptance of the current thermal environment</w:t>
+                  </w:r>
+                </w:p>
+              </w:tc>
+              <w:tc>
+                <w:tcPr/>
+                <w:p>
+                  <w:pPr>
+                    <w:pStyle w:val="Compact"/>
+                    <w:jc w:val="left"/>
+                    <w:jc w:val="center"/>
+                  </w:pPr>
+                  <w:r>
+                    <w:t xml:space="preserve">4-point continuous</w:t>
+                  </w:r>
+                </w:p>
+              </w:tc>
+              <w:tc>
+                <w:tcPr/>
+                <w:p>
+                  <w:pPr>
+                    <w:pStyle w:val="Compact"/>
+                    <w:jc w:val="left"/>
+                    <w:jc w:val="center"/>
+                  </w:pPr>
+                  <w:r>
+                    <w:t xml:space="preserve">−2 (clearly unacceptable) −1 (just unacceptable) +1 (just acceptable) +2 (clearly acceptable)</w:t>
+                  </w:r>
+                </w:p>
+              </w:tc>
+            </w:tr>
+            <w:tr>
+              <w:tc>
+                <w:tcPr/>
+                <w:p>
+                  <w:pPr>
+                    <w:pStyle w:val="Compact"/>
+                    <w:jc w:val="left"/>
+                    <w:jc w:val="center"/>
+                  </w:pPr>
+                  <w:r>
+                    <w:t xml:space="preserve">Thermal satisfaction</w:t>
+                  </w:r>
+                </w:p>
+              </w:tc>
+              <w:tc>
+                <w:tcPr/>
+                <w:p>
+                  <w:pPr>
+                    <w:pStyle w:val="Compact"/>
+                    <w:jc w:val="left"/>
+                    <w:jc w:val="center"/>
+                  </w:pPr>
+                  <w:r>
+                    <w:t xml:space="preserve">How satisfied are you with the thermal environment right now?</w:t>
+                  </w:r>
+                </w:p>
+              </w:tc>
+              <w:tc>
+                <w:tcPr/>
+                <w:p>
+                  <w:pPr>
+                    <w:pStyle w:val="Compact"/>
+                    <w:jc w:val="left"/>
+                    <w:jc w:val="center"/>
+                  </w:pPr>
+                  <w:r>
+                    <w:t xml:space="preserve">7-point continuous</w:t>
+                  </w:r>
+                </w:p>
+              </w:tc>
+              <w:tc>
+                <w:tcPr/>
+                <w:p>
+                  <w:pPr>
+                    <w:pStyle w:val="Compact"/>
+                    <w:jc w:val="left"/>
+                    <w:jc w:val="center"/>
+                  </w:pPr>
+                  <w:r>
+                    <w:t xml:space="preserve">−3 (very dissatisfied) −2 (dissatisfied) −1 (slightly dissatisfied) 0 (neither nor) +1 (slightly satisfied) +2 (satisfied) +3 (very satisfied)</w:t>
+                  </w:r>
+                </w:p>
+              </w:tc>
+            </w:tr>
+            <w:tr>
+              <w:tc>
+                <w:tcPr/>
+                <w:p>
+                  <w:pPr>
+                    <w:pStyle w:val="Compact"/>
+                    <w:jc w:val="left"/>
+                    <w:jc w:val="center"/>
+                  </w:pPr>
+                  <w:r>
+                    <w:t xml:space="preserve">Thermal pleasantness</w:t>
+                  </w:r>
+                </w:p>
+              </w:tc>
+              <w:tc>
+                <w:tcPr/>
+                <w:p>
+                  <w:pPr>
+                    <w:pStyle w:val="Compact"/>
+                    <w:jc w:val="left"/>
+                    <w:jc w:val="center"/>
+                  </w:pPr>
+                  <w:r>
+                    <w:t xml:space="preserve">Right now do you find this thermal environment…?</w:t>
+                  </w:r>
+                </w:p>
+              </w:tc>
+              <w:tc>
+                <w:tcPr/>
+                <w:p>
+                  <w:pPr>
+                    <w:pStyle w:val="Compact"/>
+                    <w:jc w:val="left"/>
+                    <w:jc w:val="center"/>
+                  </w:pPr>
+                  <w:r>
+                    <w:t xml:space="preserve">7-point continuous</w:t>
+                  </w:r>
+                </w:p>
+              </w:tc>
+              <w:tc>
+                <w:tcPr/>
+                <w:p>
+                  <w:pPr>
+                    <w:pStyle w:val="Compact"/>
+                    <w:jc w:val="left"/>
+                    <w:jc w:val="center"/>
+                  </w:pPr>
+                  <w:r>
+                    <w:t xml:space="preserve">−3 (very unpleasant) −2 (unpleasant) −1 (slightly unpleasant) 0 (neutral) +1 (slightly pleasant) +2 (pleasant) +3 (very pleasant)</w:t>
+                  </w:r>
+                </w:p>
+              </w:tc>
+            </w:tr>
+            <w:tr>
+              <w:tc>
+                <w:tcPr/>
+                <w:p>
+                  <w:pPr>
+                    <w:pStyle w:val="Compact"/>
+                    <w:jc w:val="left"/>
+                    <w:jc w:val="center"/>
+                  </w:pPr>
+                  <w:r>
+                    <w:t xml:space="preserve">Air movement acceptability at ankles</w:t>
+                  </w:r>
+                </w:p>
+              </w:tc>
+              <w:tc>
+                <w:tcPr/>
+                <w:p>
+                  <w:pPr>
+                    <w:pStyle w:val="Compact"/>
+                    <w:jc w:val="left"/>
+                    <w:jc w:val="center"/>
+                  </w:pPr>
+                  <w:r>
+                    <w:t xml:space="preserve">Please rate your acceptance of air movement at your ankles</w:t>
+                  </w:r>
+                </w:p>
+              </w:tc>
+              <w:tc>
+                <w:tcPr/>
+                <w:p>
+                  <w:pPr>
+                    <w:pStyle w:val="Compact"/>
+                    <w:jc w:val="left"/>
+                    <w:jc w:val="center"/>
+                  </w:pPr>
+                  <w:r>
+                    <w:t xml:space="preserve">4-point continuous</w:t>
+                  </w:r>
+                </w:p>
+              </w:tc>
+              <w:tc>
+                <w:tcPr/>
+                <w:p>
+                  <w:pPr>
+                    <w:pStyle w:val="Compact"/>
+                    <w:jc w:val="left"/>
+                    <w:jc w:val="center"/>
+                  </w:pPr>
+                  <w:r>
+                    <w:t xml:space="preserve">−2 (clearly unacceptable) −1 (just unacceptable) +1 (just acceptable) +2 (clearly acceptable)</w:t>
+                  </w:r>
+                </w:p>
+              </w:tc>
+            </w:tr>
+            <w:tr>
+              <w:tc>
+                <w:tcPr/>
+                <w:p>
+                  <w:pPr>
+                    <w:pStyle w:val="Compact"/>
+                    <w:jc w:val="left"/>
+                    <w:jc w:val="center"/>
+                  </w:pPr>
+                  <w:r>
+                    <w:t xml:space="preserve">Air movement preference at ankles</w:t>
+                  </w:r>
+                </w:p>
+              </w:tc>
+              <w:tc>
+                <w:tcPr/>
+                <w:p>
+                  <w:pPr>
+                    <w:pStyle w:val="Compact"/>
+                    <w:jc w:val="left"/>
+                    <w:jc w:val="center"/>
+                  </w:pPr>
+                  <w:r>
+                    <w:t xml:space="preserve">Right now around my ankles I would prefer…?</w:t>
+                  </w:r>
+                </w:p>
+              </w:tc>
+              <w:tc>
+                <w:tcPr/>
+                <w:p>
+                  <w:pPr>
+                    <w:pStyle w:val="Compact"/>
+                    <w:jc w:val="left"/>
+                    <w:jc w:val="center"/>
+                  </w:pPr>
+                  <w:r>
+                    <w:t xml:space="preserve">3-point ordinal</w:t>
+                  </w:r>
+                </w:p>
+              </w:tc>
+              <w:tc>
+                <w:tcPr/>
+                <w:p>
+                  <w:pPr>
+                    <w:pStyle w:val="Compact"/>
+                    <w:jc w:val="left"/>
+                    <w:jc w:val="center"/>
+                  </w:pPr>
+                  <w:r>
+                    <w:t xml:space="preserve">−1 (less air movement) | 0 (no change) | +1 (more air movement)</w:t>
+                  </w:r>
+                </w:p>
+              </w:tc>
+            </w:tr>
+            <w:tr>
+              <w:tc>
+                <w:tcPr/>
+                <w:p>
+                  <w:pPr>
+                    <w:pStyle w:val="Compact"/>
+                    <w:jc w:val="left"/>
+                    <w:jc w:val="center"/>
+                  </w:pPr>
+                  <w:r>
+                    <w:t xml:space="preserve">Air quality preference</w:t>
+                  </w:r>
+                </w:p>
+              </w:tc>
+              <w:tc>
+                <w:tcPr/>
+                <w:p>
+                  <w:pPr>
+                    <w:pStyle w:val="Compact"/>
+                    <w:jc w:val="left"/>
+                    <w:jc w:val="center"/>
+                  </w:pPr>
+                  <w:r>
+                    <w:t xml:space="preserve">Please rate your acceptance of the current air quality in the room</w:t>
+                  </w:r>
+                </w:p>
+              </w:tc>
+              <w:tc>
+                <w:tcPr/>
+                <w:p>
+                  <w:pPr>
+                    <w:pStyle w:val="Compact"/>
+                    <w:jc w:val="left"/>
+                    <w:jc w:val="center"/>
+                  </w:pPr>
+                  <w:r>
+                    <w:t xml:space="preserve">4-point continuous</w:t>
+                  </w:r>
+                </w:p>
+              </w:tc>
+              <w:tc>
+                <w:tcPr/>
+                <w:p>
+                  <w:pPr>
+                    <w:pStyle w:val="Compact"/>
+                    <w:jc w:val="left"/>
+                    <w:jc w:val="center"/>
+                  </w:pPr>
+                  <w:r>
+                    <w:t xml:space="preserve">−2 (clearly unacceptable) −1 (just unacceptable) +1 (just acceptable) +2 (clearly acceptable)</w:t>
+                  </w:r>
+                </w:p>
+              </w:tc>
+            </w:tr>
+            <w:tr>
+              <w:tc>
+                <w:tcPr/>
+                <w:p>
+                  <w:pPr>
+                    <w:pStyle w:val="Compact"/>
+                    <w:jc w:val="left"/>
+                    <w:jc w:val="center"/>
+                  </w:pPr>
+                  <w:r>
+                    <w:t xml:space="preserve">Clothing change</w:t>
+                  </w:r>
+                </w:p>
+              </w:tc>
+              <w:tc>
+                <w:tcPr/>
+                <w:p>
+                  <w:pPr>
+                    <w:pStyle w:val="Compact"/>
+                    <w:jc w:val="left"/>
+                    <w:jc w:val="center"/>
+                  </w:pPr>
+                  <w:r>
+                    <w:t xml:space="preserve">Did you adjust your upper body clothing?</w:t>
+                  </w:r>
+                </w:p>
+              </w:tc>
+              <w:tc>
+                <w:tcPr/>
+                <w:p>
+                  <w:pPr>
+                    <w:pStyle w:val="Compact"/>
+                    <w:jc w:val="left"/>
+                    <w:jc w:val="center"/>
+                  </w:pPr>
+                  <w:r>
+                    <w:t xml:space="preserve">binary</w:t>
+                  </w:r>
+                </w:p>
+              </w:tc>
+              <w:tc>
+                <w:tcPr/>
+                <w:p>
+                  <w:pPr>
+                    <w:pStyle w:val="Compact"/>
+                    <w:jc w:val="left"/>
+                    <w:jc w:val="center"/>
+                  </w:pPr>
+                  <w:r>
+                    <w:t xml:space="preserve">—</w:t>
+                  </w:r>
+                </w:p>
+              </w:tc>
+            </w:tr>
+          </w:tbl>
+          <w:bookmarkEnd w:id="29"/>
+          <w:p/>
+        </w:tc>
+      </w:tr>
+    </w:tbl>
+    <w:p>
+      <w:pPr>
+        <w:pStyle w:val="BodyText"/>
+      </w:pPr>
+      <w:r>
+        <w:t xml:space="preserve">Surveys were administered electronically via Qualtrics. Participants</w:t>
+      </w:r>
+      <w:r>
+        <w:t xml:space="preserve"> </w:t>
+      </w:r>
+      <w:r>
+        <w:t xml:space="preserve">were not required to respond to any individual question, though</w:t>
+      </w:r>
+      <w:r>
+        <w:t xml:space="preserve"> </w:t>
+      </w:r>
+      <w:r>
+        <w:t xml:space="preserve">completion rates were monitored.</w:t>
+      </w:r>
+    </w:p>
+    <w:bookmarkEnd w:id="30"/>
+    <w:bookmarkStart w:id="31" w:name="physiological-measurements"/>
+    <w:p>
+      <w:pPr>
+        <w:pStyle w:val="Heading2"/>
+      </w:pPr>
+      <w:r>
+        <w:t xml:space="preserve">2.8 Physiological measurements</w:t>
+      </w:r>
+    </w:p>
+    <w:p>
+      <w:pPr>
+        <w:pStyle w:val="FirstParagraph"/>
+      </w:pPr>
+      <w:r>
+        <w:t xml:space="preserve">Skin temperature was recorded continuously using the iButton sensors</w:t>
+      </w:r>
+      <w:r>
+        <w:t xml:space="preserve"> </w:t>
+      </w:r>
+      <w:r>
+        <w:t xml:space="preserve">attached with medical-grade hypoallergenic tape. Sensors were placed on</w:t>
+      </w:r>
+      <w:r>
+        <w:t xml:space="preserve"> </w:t>
+      </w:r>
+      <w:r>
+        <w:t xml:space="preserve">the lateral lower leg (mid-calf) and feet. Skin temperature data were</w:t>
+      </w:r>
+      <w:r>
+        <w:t xml:space="preserve"> </w:t>
+      </w:r>
+      <w:r>
+        <w:t xml:space="preserve">used to assess local cooling responses and as physiological correlates</w:t>
+      </w:r>
+      <w:r>
+        <w:t xml:space="preserve"> </w:t>
+      </w:r>
+      <w:r>
+        <w:t xml:space="preserve">of subjective thermal sensation.</w:t>
+      </w:r>
+    </w:p>
+    <w:bookmarkEnd w:id="31"/>
+    <w:bookmarkStart w:id="32" w:name="statistical-analysis-and-data-processing"/>
+    <w:p>
+      <w:pPr>
+        <w:pStyle w:val="Heading2"/>
+      </w:pPr>
+      <w:r>
+        <w:t xml:space="preserve">2.9 Statistical analysis and data processing</w:t>
+      </w:r>
+    </w:p>
+    <w:bookmarkEnd w:id="32"/>
+    <w:bookmarkEnd w:id="33"/>
+    <w:bookmarkStart w:id="49" w:name="results"/>
+    <w:p>
+      <w:pPr>
+        <w:pStyle w:val="Heading1"/>
+      </w:pPr>
+      <w:r>
+        <w:t xml:space="preserve">3. Results</w:t>
+      </w:r>
+    </w:p>
+    <w:bookmarkStart w:id="36" w:name="X7c2c88ad051007eed246cb0019e3320707ea507"/>
+    <w:p>
+      <w:pPr>
+        <w:pStyle w:val="Heading2"/>
+      </w:pPr>
+      <w:r>
+        <w:t xml:space="preserve">3.1 Participants and environmental conditions</w:t>
+      </w:r>
+    </w:p>
+    <w:tbl>
+      <w:tblPr>
+        <w:tblStyle w:val="Table"/>
+        <w:tblW w:type="pct" w:w="5000"/>
+        <w:tblLayout w:type="fixed"/>
+        <w:tblLook w:firstRow="0" w:lastRow="0" w:firstColumn="0" w:lastColumn="0" w:noHBand="0" w:noVBand="0" w:val="0000"/>
+      </w:tblPr>
+      <w:tblGrid>
+        <w:gridCol w:w="7920"/>
+      </w:tblGrid>
+      <w:tr>
+        <w:tc>
+          <w:tcPr/>
+          <w:bookmarkStart w:id="34" w:name="tbl-demographics"/>
+          <w:p>
+            <w:pPr>
+              <w:jc w:val="center"/>
+            </w:pPr>
+            <w:pPr>
+              <w:jc w:val="left"/>
+              <w:spacing w:before="200"/>
+              <w:pStyle w:val="ImageCaption"/>
+            </w:pPr>
+            <w:r>
+              <w:t xml:space="preserve">Table 2: Summary of demographic information (mean ± SD) on study participants.</w:t>
             </w:r>
           </w:p>
           <w:tbl>
@@ -1912,7 +2392,7 @@
               </w:tc>
             </w:tr>
           </w:tbl>
-          <w:bookmarkEnd w:id="33"/>
+          <w:bookmarkEnd w:id="34"/>
           <w:p/>
         </w:tc>
       </w:tr>
@@ -1930,7 +2410,7 @@
       <w:tr>
         <w:tc>
           <w:tcPr/>
-          <w:bookmarkStart w:id="34" w:name="tbl-env"/>
+          <w:bookmarkStart w:id="35" w:name="tbl-env"/>
           <w:p>
             <w:pPr>
               <w:jc w:val="center"/>
@@ -1941,7 +2421,7 @@
               <w:pStyle w:val="ImageCaption"/>
             </w:pPr>
             <w:r>
-              <w:t xml:space="preserve">Table 2: Summary of environmental measurements.</w:t>
+              <w:t xml:space="preserve">Table 3: Summary of environmental measurements.</w:t>
             </w:r>
           </w:p>
           <w:tbl>
@@ -2609,13 +3089,13 @@
               </w:tc>
             </w:tr>
           </w:tbl>
-          <w:bookmarkEnd w:id="34"/>
+          <w:bookmarkEnd w:id="35"/>
           <w:p/>
         </w:tc>
       </w:tr>
     </w:tbl>
-    <w:bookmarkEnd w:id="35"/>
-    <w:bookmarkStart w:id="40" w:name="thermal-sensation-and-comfort-responses"/>
+    <w:bookmarkEnd w:id="36"/>
+    <w:bookmarkStart w:id="41" w:name="thermal-sensation-and-comfort-responses"/>
     <w:p>
       <w:pPr>
         <w:pStyle w:val="Heading2"/>
@@ -2637,7 +3117,7 @@
       <w:tr>
         <w:tc>
           <w:tcPr/>
-          <w:bookmarkStart w:id="39" w:name="fig-thermal-perception"/>
+          <w:bookmarkStart w:id="40" w:name="fig-thermal-perception"/>
           <w:p>
             <w:pPr>
               <w:pStyle w:val="Compact"/>
@@ -2648,18 +3128,18 @@
                 <wp:inline>
                   <wp:extent cx="5943600" cy="5846245"/>
                   <wp:effectExtent b="0" l="0" r="0" t="0"/>
-                  <wp:docPr descr="" title="" id="37" name="Picture"/>
+                  <wp:docPr descr="" title="" id="38" name="Picture"/>
                   <a:graphic>
                     <a:graphicData uri="http://schemas.openxmlformats.org/drawingml/2006/picture">
                       <pic:pic>
                         <pic:nvPicPr>
-                          <pic:cNvPr descr="figs/thermal_perception.png" id="38" name="Picture"/>
+                          <pic:cNvPr descr="figs/thermal_perception.png" id="39" name="Picture"/>
                           <pic:cNvPicPr>
                             <a:picLocks noChangeArrowheads="1" noChangeAspect="1"/>
                           </pic:cNvPicPr>
                         </pic:nvPicPr>
                         <pic:blipFill>
-                          <a:blip r:embed="rId36"/>
+                          <a:blip r:embed="rId37"/>
                           <a:stretch>
                             <a:fillRect/>
                           </a:stretch>
@@ -2705,12 +3185,12 @@
               <w:t xml:space="preserve">acceptability.</w:t>
             </w:r>
           </w:p>
-          <w:bookmarkEnd w:id="39"/>
+          <w:bookmarkEnd w:id="40"/>
         </w:tc>
       </w:tr>
     </w:tbl>
-    <w:bookmarkEnd w:id="40"/>
-    <w:bookmarkStart w:id="45" w:name="air-movement-acceptability-at-ankles"/>
+    <w:bookmarkEnd w:id="41"/>
+    <w:bookmarkStart w:id="46" w:name="air-movement-acceptability-at-ankles"/>
     <w:p>
       <w:pPr>
         <w:pStyle w:val="Heading2"/>
@@ -2732,7 +3212,7 @@
       <w:tr>
         <w:tc>
           <w:tcPr/>
-          <w:bookmarkStart w:id="44" w:name="fig-air-move-acc-pref"/>
+          <w:bookmarkStart w:id="45" w:name="fig-air-move-acc-pref"/>
           <w:p>
             <w:pPr>
               <w:pStyle w:val="Compact"/>
@@ -2743,18 +3223,18 @@
                 <wp:inline>
                   <wp:extent cx="3208646" cy="4328282"/>
                   <wp:effectExtent b="0" l="0" r="0" t="0"/>
-                  <wp:docPr descr="" title="" id="42" name="Picture"/>
+                  <wp:docPr descr="" title="" id="43" name="Picture"/>
                   <a:graphic>
                     <a:graphicData uri="http://schemas.openxmlformats.org/drawingml/2006/picture">
                       <pic:pic>
                         <pic:nvPicPr>
-                          <pic:cNvPr descr="figs/air_movement_acc_pref.png" id="43" name="Picture"/>
+                          <pic:cNvPr descr="figs/air_movement_acc_pref.png" id="44" name="Picture"/>
                           <pic:cNvPicPr>
                             <a:picLocks noChangeArrowheads="1" noChangeAspect="1"/>
                           </pic:cNvPicPr>
                         </pic:nvPicPr>
                         <pic:blipFill>
-                          <a:blip r:embed="rId41"/>
+                          <a:blip r:embed="rId42"/>
                           <a:stretch>
                             <a:fillRect/>
                           </a:stretch>
@@ -2800,12 +3280,12 @@
               <w:t xml:space="preserve">preference.</w:t>
             </w:r>
           </w:p>
-          <w:bookmarkEnd w:id="44"/>
+          <w:bookmarkEnd w:id="45"/>
         </w:tc>
       </w:tr>
     </w:tbl>
-    <w:bookmarkEnd w:id="45"/>
-    <w:bookmarkStart w:id="46" w:name="dissatisfaction-with-ankle-draft"/>
+    <w:bookmarkEnd w:id="46"/>
+    <w:bookmarkStart w:id="47" w:name="dissatisfaction-with-ankle-draft"/>
     <w:p>
       <w:pPr>
         <w:pStyle w:val="Heading2"/>
@@ -2814,8 +3294,8 @@
         <w:t xml:space="preserve">3.4 Dissatisfaction with ankle draft</w:t>
       </w:r>
     </w:p>
-    <w:bookmarkEnd w:id="46"/>
-    <w:bookmarkStart w:id="47" w:name="updated-model-for-winter-conditions"/>
+    <w:bookmarkEnd w:id="47"/>
+    <w:bookmarkStart w:id="48" w:name="updated-model-for-winter-conditions"/>
     <w:p>
       <w:pPr>
         <w:pStyle w:val="Heading2"/>
@@ -2824,9 +3304,9 @@
         <w:t xml:space="preserve">3.5 Updated model for winter conditions</w:t>
       </w:r>
     </w:p>
-    <w:bookmarkEnd w:id="47"/>
     <w:bookmarkEnd w:id="48"/>
-    <w:bookmarkStart w:id="54" w:name="discussion"/>
+    <w:bookmarkEnd w:id="49"/>
+    <w:bookmarkStart w:id="55" w:name="discussion"/>
     <w:p>
       <w:pPr>
         <w:pStyle w:val="Heading1"/>
@@ -2849,7 +3329,7 @@
         <w:t xml:space="preserve">winter clothing effect on ankle draft sensitivity].</w:t>
       </w:r>
     </w:p>
-    <w:bookmarkStart w:id="49" w:name="comparison-with-prior-research"/>
+    <w:bookmarkStart w:id="50" w:name="comparison-with-prior-research"/>
     <w:p>
       <w:pPr>
         <w:pStyle w:val="Heading2"/>
@@ -2858,8 +3338,8 @@
         <w:t xml:space="preserve">4.1 Comparison with prior research</w:t>
       </w:r>
     </w:p>
-    <w:bookmarkEnd w:id="49"/>
-    <w:bookmarkStart w:id="50" w:name="mechanisms"/>
+    <w:bookmarkEnd w:id="50"/>
+    <w:bookmarkStart w:id="51" w:name="mechanisms"/>
     <w:p>
       <w:pPr>
         <w:pStyle w:val="Heading2"/>
@@ -2868,8 +3348,8 @@
         <w:t xml:space="preserve">4.2 Mechanisms</w:t>
       </w:r>
     </w:p>
-    <w:bookmarkEnd w:id="50"/>
-    <w:bookmarkStart w:id="51" w:name="implications-for-building-design"/>
+    <w:bookmarkEnd w:id="51"/>
+    <w:bookmarkStart w:id="52" w:name="implications-for-building-design"/>
     <w:p>
       <w:pPr>
         <w:pStyle w:val="Heading2"/>
@@ -2878,8 +3358,8 @@
         <w:t xml:space="preserve">4.3 Implications for building design</w:t>
       </w:r>
     </w:p>
-    <w:bookmarkEnd w:id="51"/>
-    <w:bookmarkStart w:id="52" w:name="relationship-to-standards"/>
+    <w:bookmarkEnd w:id="52"/>
+    <w:bookmarkStart w:id="53" w:name="relationship-to-standards"/>
     <w:p>
       <w:pPr>
         <w:pStyle w:val="Heading2"/>
@@ -2888,8 +3368,8 @@
         <w:t xml:space="preserve">4.4 Relationship to standards</w:t>
       </w:r>
     </w:p>
-    <w:bookmarkEnd w:id="52"/>
-    <w:bookmarkStart w:id="53" w:name="limitations"/>
+    <w:bookmarkEnd w:id="53"/>
+    <w:bookmarkStart w:id="54" w:name="limitations"/>
     <w:p>
       <w:pPr>
         <w:pStyle w:val="Heading2"/>
@@ -2898,9 +3378,9 @@
         <w:t xml:space="preserve">4.5 Limitations</w:t>
       </w:r>
     </w:p>
-    <w:bookmarkEnd w:id="53"/>
     <w:bookmarkEnd w:id="54"/>
-    <w:bookmarkStart w:id="56" w:name="conclusions"/>
+    <w:bookmarkEnd w:id="55"/>
+    <w:bookmarkStart w:id="57" w:name="conclusions"/>
     <w:p>
       <w:pPr>
         <w:pStyle w:val="Heading1"/>
@@ -2909,7 +3389,7 @@
         <w:t xml:space="preserve">5. Conclusions</w:t>
       </w:r>
     </w:p>
-    <w:bookmarkStart w:id="55" w:name="limitations-1"/>
+    <w:bookmarkStart w:id="56" w:name="limitations-1"/>
     <w:p>
       <w:pPr>
         <w:pStyle w:val="Heading2"/>
@@ -2918,9 +3398,9 @@
         <w:t xml:space="preserve">5.1 Limitations</w:t>
       </w:r>
     </w:p>
-    <w:bookmarkEnd w:id="55"/>
     <w:bookmarkEnd w:id="56"/>
-    <w:bookmarkStart w:id="57" w:name="conclusions-1"/>
+    <w:bookmarkEnd w:id="57"/>
+    <w:bookmarkStart w:id="58" w:name="conclusions-1"/>
     <w:p>
       <w:pPr>
         <w:pStyle w:val="Heading1"/>
@@ -2929,8 +3409,8 @@
         <w:t xml:space="preserve">6. Conclusions</w:t>
       </w:r>
     </w:p>
-    <w:bookmarkEnd w:id="57"/>
-    <w:bookmarkStart w:id="58" w:name="credit-authorship-contribution-statement"/>
+    <w:bookmarkEnd w:id="58"/>
+    <w:bookmarkStart w:id="59" w:name="credit-authorship-contribution-statement"/>
     <w:p>
       <w:pPr>
         <w:pStyle w:val="Heading1"/>
@@ -2991,8 +3471,8 @@
         <w:t xml:space="preserve">administration, Supervision, Writing - review &amp; editing.</w:t>
       </w:r>
     </w:p>
-    <w:bookmarkEnd w:id="58"/>
-    <w:bookmarkStart w:id="59" w:name="declaration-of-competing-interest"/>
+    <w:bookmarkEnd w:id="59"/>
+    <w:bookmarkStart w:id="60" w:name="declaration-of-competing-interest"/>
     <w:p>
       <w:pPr>
         <w:pStyle w:val="Heading1"/>
@@ -3045,8 +3525,8 @@
         <w:t xml:space="preserve">agencies, and utilities.</w:t>
       </w:r>
     </w:p>
-    <w:bookmarkEnd w:id="59"/>
-    <w:bookmarkStart w:id="60" w:name="data-availability"/>
+    <w:bookmarkEnd w:id="60"/>
+    <w:bookmarkStart w:id="61" w:name="data-availability"/>
     <w:p>
       <w:pPr>
         <w:pStyle w:val="Heading1"/>
@@ -3075,8 +3555,8 @@
         <w:t xml:space="preserve">following GitHub repository: XXX.</w:t>
       </w:r>
     </w:p>
-    <w:bookmarkEnd w:id="60"/>
-    <w:bookmarkStart w:id="61" w:name="X071796dd6bc546c91e96cca1cf5ff96599de61f"/>
+    <w:bookmarkEnd w:id="61"/>
+    <w:bookmarkStart w:id="62" w:name="X071796dd6bc546c91e96cca1cf5ff96599de61f"/>
     <w:p>
       <w:pPr>
         <w:pStyle w:val="Heading1"/>
@@ -3096,7 +3576,7 @@
         <w:t xml:space="preserve"> </w:t>
       </w:r>
       <w:r>
-        <w:t xml:space="preserve">ChatGPT to enhance the language and readability of the content.</w:t>
+        <w:t xml:space="preserve">Claude to enhance the language and readability of the content.</w:t>
       </w:r>
       <w:r>
         <w:t xml:space="preserve"> </w:t>
@@ -3111,8 +3591,8 @@
         <w:t xml:space="preserve">maintaining full accountability for the publication’s content.</w:t>
       </w:r>
     </w:p>
-    <w:bookmarkEnd w:id="61"/>
-    <w:bookmarkStart w:id="62" w:name="acknowledgements"/>
+    <w:bookmarkEnd w:id="62"/>
+    <w:bookmarkStart w:id="63" w:name="acknowledgements"/>
     <w:p>
       <w:pPr>
         <w:pStyle w:val="Heading1"/>
@@ -3132,29 +3612,11 @@
         <w:t xml:space="preserve"> </w:t>
       </w:r>
       <w:r>
-        <w:t xml:space="preserve">Berkeley supported this research. The authors also want to thank</w:t>
-      </w:r>
-      <w:r>
-        <w:t xml:space="preserve"> </w:t>
-      </w:r>
-      <w:r>
-        <w:t xml:space="preserve">dedicated undergraduate students Heijin Hong, Lana Fiona Lilienstein,</w:t>
-      </w:r>
-      <w:r>
-        <w:t xml:space="preserve"> </w:t>
-      </w:r>
-      <w:r>
-        <w:t xml:space="preserve">Kevin Kim and Gayle Boyd for their voluntary support throughout the</w:t>
-      </w:r>
-      <w:r>
-        <w:t xml:space="preserve"> </w:t>
-      </w:r>
-      <w:r>
-        <w:t xml:space="preserve">experimental phase.</w:t>
-      </w:r>
-    </w:p>
-    <w:bookmarkEnd w:id="62"/>
-    <w:bookmarkStart w:id="72" w:name="references"/>
+        <w:t xml:space="preserve">Berkeley supported this research.</w:t>
+      </w:r>
+    </w:p>
+    <w:bookmarkEnd w:id="63"/>
+    <w:bookmarkStart w:id="73" w:name="references"/>
     <w:p>
       <w:pPr>
         <w:pStyle w:val="Heading1"/>
@@ -3163,8 +3625,8 @@
         <w:t xml:space="preserve">References</w:t>
       </w:r>
     </w:p>
-    <w:bookmarkStart w:id="71" w:name="refs"/>
-    <w:bookmarkStart w:id="63" w:name="ref-ashraeANSIASHRAEStandard2023"/>
+    <w:bookmarkStart w:id="72" w:name="refs"/>
+    <w:bookmarkStart w:id="64" w:name="ref-ashraeANSIASHRAEStandard2023"/>
     <w:p>
       <w:pPr>
         <w:pStyle w:val="Bibliography"/>
@@ -3312,8 +3774,8 @@
         <w:t xml:space="preserve">. American Society of Heating, Refrigerating; Air-Conditioning Engineers.</w:t>
       </w:r>
     </w:p>
-    <w:bookmarkEnd w:id="63"/>
-    <w:bookmarkStart w:id="65" w:name="X9df5917af8f84de39d37f25bb914b381b4d01ad"/>
+    <w:bookmarkEnd w:id="64"/>
+    <w:bookmarkStart w:id="66" w:name="X9df5917af8f84de39d37f25bb914b381b4d01ad"/>
     <w:p>
       <w:pPr>
         <w:pStyle w:val="Bibliography"/>
@@ -3389,7 +3851,7 @@
       <w:r>
         <w:t xml:space="preserve"> </w:t>
       </w:r>
-      <w:hyperlink r:id="rId64">
+      <w:hyperlink r:id="rId65">
         <w:r>
           <w:rPr>
             <w:rStyle w:val="Hyperlink"/>
@@ -3398,8 +3860,8 @@
         </w:r>
       </w:hyperlink>
     </w:p>
-    <w:bookmarkEnd w:id="65"/>
-    <w:bookmarkStart w:id="66" w:name="ref-heiselbergDraftComfortReview1994"/>
+    <w:bookmarkEnd w:id="66"/>
+    <w:bookmarkStart w:id="67" w:name="ref-heiselbergDraftComfortReview1994"/>
     <w:p>
       <w:pPr>
         <w:pStyle w:val="Bibliography"/>
@@ -3434,8 +3896,8 @@
         <w:t xml:space="preserve">, 1073–1081.</w:t>
       </w:r>
     </w:p>
-    <w:bookmarkEnd w:id="66"/>
-    <w:bookmarkStart w:id="68" w:name="X0e41857b9754d3f46055296e8711d0a459bcc8a"/>
+    <w:bookmarkEnd w:id="67"/>
+    <w:bookmarkStart w:id="69" w:name="X0e41857b9754d3f46055296e8711d0a459bcc8a"/>
     <w:p>
       <w:pPr>
         <w:pStyle w:val="Bibliography"/>
@@ -3472,7 +3934,7 @@
       <w:r>
         <w:t xml:space="preserve"> </w:t>
       </w:r>
-      <w:hyperlink r:id="rId67">
+      <w:hyperlink r:id="rId68">
         <w:r>
           <w:rPr>
             <w:rStyle w:val="Hyperlink"/>
@@ -3481,8 +3943,8 @@
         </w:r>
       </w:hyperlink>
     </w:p>
-    <w:bookmarkEnd w:id="68"/>
-    <w:bookmarkStart w:id="70" w:name="ref-schiavonSensationDraftUncovered2016"/>
+    <w:bookmarkEnd w:id="69"/>
+    <w:bookmarkStart w:id="71" w:name="ref-schiavonSensationDraftUncovered2016"/>
     <w:p>
       <w:pPr>
         <w:pStyle w:val="Bibliography"/>
@@ -3519,7 +3981,7 @@
       <w:r>
         <w:t xml:space="preserve"> </w:t>
       </w:r>
-      <w:hyperlink r:id="rId69">
+      <w:hyperlink r:id="rId70">
         <w:r>
           <w:rPr>
             <w:rStyle w:val="Hyperlink"/>
@@ -3528,9 +3990,9 @@
         </w:r>
       </w:hyperlink>
     </w:p>
-    <w:bookmarkEnd w:id="70"/>
     <w:bookmarkEnd w:id="71"/>
     <w:bookmarkEnd w:id="72"/>
+    <w:bookmarkEnd w:id="73"/>
     <w:sectPr>
       <w:footnotePr>
         <w:numRestart w:val="eachSect"/>
@@ -3810,109 +4272,6 @@
       </w:pPr>
     </w:lvl>
   </w:abstractNum>
-  <w:abstractNum w:abstractNumId="991">
-    <w:nsid w:val="0000A991"/>
-    <w:multiLevelType w:val="multilevel"/>
-    <w:lvl w:ilvl="0">
-      <w:numFmt w:val="bullet"/>
-      <w:lvlText w:val=""/>
-      <w:lvlJc w:val="left"/>
-      <w:pPr>
-        <w:ind w:left="720" w:hanging="360"/>
-      </w:pPr>
-      <w:rPr>
-        <w:rFonts w:ascii="Symbol" w:hAnsi="Symbol" w:cs="Symbol" w:hint="default"/>
-      </w:rPr>
-    </w:lvl>
-    <w:lvl w:ilvl="1">
-      <w:numFmt w:val="bullet"/>
-      <w:lvlText w:val="o"/>
-      <w:lvlJc w:val="left"/>
-      <w:pPr>
-        <w:ind w:left="1440" w:hanging="360"/>
-      </w:pPr>
-      <w:rPr>
-        <w:rFonts w:ascii="Courier New" w:hAnsi="Courier New" w:cs="Courier New" w:hint="default"/>
-      </w:rPr>
-    </w:lvl>
-    <w:lvl w:ilvl="2">
-      <w:numFmt w:val="bullet"/>
-      <w:lvlText w:val=""/>
-      <w:lvlJc w:val="left"/>
-      <w:pPr>
-        <w:ind w:left="2160" w:hanging="360"/>
-      </w:pPr>
-      <w:rPr>
-        <w:rFonts w:ascii="Wingdings" w:hAnsi="Wingdings" w:cs="Wingdings" w:hint="default"/>
-      </w:rPr>
-    </w:lvl>
-    <w:lvl w:ilvl="3">
-      <w:numFmt w:val="bullet"/>
-      <w:lvlText w:val=""/>
-      <w:lvlJc w:val="left"/>
-      <w:pPr>
-        <w:ind w:left="2880" w:hanging="360"/>
-      </w:pPr>
-      <w:rPr>
-        <w:rFonts w:ascii="Symbol" w:hAnsi="Symbol" w:cs="Symbol" w:hint="default"/>
-      </w:rPr>
-    </w:lvl>
-    <w:lvl w:ilvl="4">
-      <w:numFmt w:val="bullet"/>
-      <w:lvlText w:val="o"/>
-      <w:lvlJc w:val="left"/>
-      <w:pPr>
-        <w:ind w:left="3600" w:hanging="360"/>
-      </w:pPr>
-      <w:rPr>
-        <w:rFonts w:ascii="Courier New" w:hAnsi="Courier New" w:cs="Courier New" w:hint="default"/>
-      </w:rPr>
-    </w:lvl>
-    <w:lvl w:ilvl="5">
-      <w:numFmt w:val="bullet"/>
-      <w:lvlText w:val=""/>
-      <w:lvlJc w:val="left"/>
-      <w:pPr>
-        <w:ind w:left="4320" w:hanging="360"/>
-      </w:pPr>
-      <w:rPr>
-        <w:rFonts w:ascii="Wingdings" w:hAnsi="Wingdings" w:cs="Wingdings" w:hint="default"/>
-      </w:rPr>
-    </w:lvl>
-    <w:lvl w:ilvl="6">
-      <w:numFmt w:val="bullet"/>
-      <w:lvlText w:val=""/>
-      <w:lvlJc w:val="left"/>
-      <w:pPr>
-        <w:ind w:left="5040" w:hanging="360"/>
-      </w:pPr>
-      <w:rPr>
-        <w:rFonts w:ascii="Symbol" w:hAnsi="Symbol" w:cs="Symbol" w:hint="default"/>
-      </w:rPr>
-    </w:lvl>
-    <w:lvl w:ilvl="7">
-      <w:numFmt w:val="bullet"/>
-      <w:lvlText w:val="o"/>
-      <w:lvlJc w:val="left"/>
-      <w:pPr>
-        <w:ind w:left="5760" w:hanging="360"/>
-      </w:pPr>
-      <w:rPr>
-        <w:rFonts w:ascii="Courier New" w:hAnsi="Courier New" w:cs="Courier New" w:hint="default"/>
-      </w:rPr>
-    </w:lvl>
-    <w:lvl w:ilvl="8">
-      <w:numFmt w:val="bullet"/>
-      <w:lvlText w:val=""/>
-      <w:lvlJc w:val="left"/>
-      <w:pPr>
-        <w:ind w:left="6480" w:hanging="360"/>
-      </w:pPr>
-      <w:rPr>
-        <w:rFonts w:ascii="Wingdings" w:hAnsi="Wingdings" w:cs="Wingdings" w:hint="default"/>
-      </w:rPr>
-    </w:lvl>
-  </w:abstractNum>
   <w:num w16cid:durableId="1525049132" w:numId="1">
     <w:abstractNumId w:val="0"/>
   </w:num>
@@ -3921,9 +4280,6 @@
   </w:num>
   <w:num w:numId="1000">
     <w:abstractNumId w:val="990"/>
-  </w:num>
-  <w:num w:numId="1001">
-    <w:abstractNumId w:val="991"/>
   </w:num>
 </w:numbering>
 </file>

</xml_diff>

<commit_message>
build:: update env + demographics table
</commit_message>
<xml_diff>
--- a/manuscript/manuscript.docx
+++ b/manuscript/manuscript.docx
@@ -47,7 +47,7 @@
         <w:pStyle w:val="Date"/>
       </w:pPr>
       <w:r>
-        <w:t xml:space="preserve">2026-03-24</w:t>
+        <w:t xml:space="preserve">2026-04-09</w:t>
       </w:r>
     </w:p>
     <w:p>
@@ -755,6 +755,14 @@
       </w:r>
       <w:r>
         <w:t xml:space="preserve">the ASHRAE seven-point scale.</w:t>
+      </w:r>
+    </w:p>
+    <w:p>
+      <w:pPr>
+        <w:pStyle w:val="BodyText"/>
+      </w:pPr>
+      <w:r>
+        <w:t xml:space="preserve">PLACEHOLDER GRAPHIC</w:t>
       </w:r>
     </w:p>
     <w:p>
@@ -2081,7 +2089,7 @@
                     <w:jc w:val="center"/>
                   </w:pPr>
                   <w:r>
-                    <w:t xml:space="preserve">all</w:t>
+                    <w:t xml:space="preserve">All</w:t>
                   </w:r>
                 </w:p>
               </w:tc>
@@ -2161,7 +2169,7 @@
                     <w:jc w:val="center"/>
                   </w:pPr>
                   <w:r>
-                    <w:t xml:space="preserve">female</w:t>
+                    <w:t xml:space="preserve">Female</w:t>
                   </w:r>
                 </w:p>
               </w:tc>
@@ -2241,7 +2249,7 @@
                     <w:jc w:val="center"/>
                   </w:pPr>
                   <w:r>
-                    <w:t xml:space="preserve">male</w:t>
+                    <w:t xml:space="preserve">Male</w:t>
                   </w:r>
                 </w:p>
               </w:tc>
@@ -2321,7 +2329,7 @@
                     <w:jc w:val="center"/>
                   </w:pPr>
                   <w:r>
-                    <w:t xml:space="preserve">third gender / other</w:t>
+                    <w:t xml:space="preserve">Third Gender / Other</w:t>
                   </w:r>
                 </w:p>
               </w:tc>
@@ -2504,7 +2512,7 @@
                     <w:jc w:val="center"/>
                   </w:pPr>
                   <w:r>
-                    <w:t xml:space="preserve">t_air_c</w:t>
+                    <w:t xml:space="preserve">Room Air Temp.(°C)</w:t>
                   </w:r>
                 </w:p>
               </w:tc>
@@ -2558,7 +2566,7 @@
                     <w:jc w:val="center"/>
                   </w:pPr>
                   <w:r>
-                    <w:t xml:space="preserve">rh_percent</w:t>
+                    <w:t xml:space="preserve">Relative Humidity (%)</w:t>
                   </w:r>
                 </w:p>
               </w:tc>
@@ -2612,7 +2620,16 @@
                     <w:jc w:val="center"/>
                   </w:pPr>
                   <w:r>
-                    <w:t xml:space="preserve">low_v_air_s</w:t>
+                    <w:t xml:space="preserve">v</w:t>
+                  </w:r>
+                  <w:r>
+                    <w:t xml:space="preserve">air,low</w:t>
+                  </w:r>
+                  <w:r>
+                    <w:t xml:space="preserve"> </w:t>
+                  </w:r>
+                  <w:r>
+                    <w:t xml:space="preserve">(m/s)</w:t>
                   </w:r>
                 </w:p>
               </w:tc>
@@ -2666,7 +2683,7 @@
                     <w:jc w:val="center"/>
                   </w:pPr>
                   <w:r>
-                    <w:t xml:space="preserve">med_v_air_s</w:t>
+                    <w:t xml:space="preserve">Med Airspeed (m/s)</w:t>
                   </w:r>
                 </w:p>
               </w:tc>
@@ -2720,7 +2737,7 @@
                     <w:jc w:val="center"/>
                   </w:pPr>
                   <w:r>
-                    <w:t xml:space="preserve">high_v_air_s</w:t>
+                    <w:t xml:space="preserve">High Airspeed (m/s)</w:t>
                   </w:r>
                 </w:p>
               </w:tc>
@@ -2774,7 +2791,7 @@
                     <w:jc w:val="center"/>
                   </w:pPr>
                   <w:r>
-                    <w:t xml:space="preserve">low_t_supply_c</w:t>
+                    <w:t xml:space="preserve">Low Supply Temp (°C)</w:t>
                   </w:r>
                 </w:p>
               </w:tc>
@@ -2828,7 +2845,7 @@
                     <w:jc w:val="center"/>
                   </w:pPr>
                   <w:r>
-                    <w:t xml:space="preserve">med_t_supply_c</w:t>
+                    <w:t xml:space="preserve">Med Supply Temp (°C)</w:t>
                   </w:r>
                 </w:p>
               </w:tc>
@@ -2882,7 +2899,7 @@
                     <w:jc w:val="center"/>
                   </w:pPr>
                   <w:r>
-                    <w:t xml:space="preserve">high_t_supply_c</w:t>
+                    <w:t xml:space="preserve">High Supply Temp (°C)</w:t>
                   </w:r>
                 </w:p>
               </w:tc>
@@ -2936,7 +2953,7 @@
                     <w:jc w:val="center"/>
                   </w:pPr>
                   <w:r>
-                    <w:t xml:space="preserve">low_turbulence_intensity</w:t>
+                    <w:t xml:space="preserve">Low Turbulence (%)</w:t>
                   </w:r>
                 </w:p>
               </w:tc>
@@ -2990,7 +3007,7 @@
                     <w:jc w:val="center"/>
                   </w:pPr>
                   <w:r>
-                    <w:t xml:space="preserve">med_turbulence_intensity</w:t>
+                    <w:t xml:space="preserve">Med Turbulence (%)</w:t>
                   </w:r>
                 </w:p>
               </w:tc>
@@ -3044,7 +3061,7 @@
                     <w:jc w:val="center"/>
                   </w:pPr>
                   <w:r>
-                    <w:t xml:space="preserve">high_turbulence_intensity</w:t>
+                    <w:t xml:space="preserve">High Turbulence (%)</w:t>
                   </w:r>
                 </w:p>
               </w:tc>
@@ -3532,7 +3549,7 @@
         <w:pStyle w:val="Heading1"/>
       </w:pPr>
       <w:r>
-        <w:t xml:space="preserve">7. Data availability</w:t>
+        <w:t xml:space="preserve">Data availability</w:t>
       </w:r>
     </w:p>
     <w:p>
@@ -3562,7 +3579,7 @@
         <w:pStyle w:val="Heading1"/>
       </w:pPr>
       <w:r>
-        <w:t xml:space="preserve">8. Declaration of Generative AI and AI-assisted technologies in the writing process</w:t>
+        <w:t xml:space="preserve">Declaration of Generative AI and AI-assisted technologies in the writing process</w:t>
       </w:r>
     </w:p>
     <w:p>

</xml_diff>